<commit_message>
Point the API proxy at the deployed backend
</commit_message>
<xml_diff>
--- a/Project_SRS.docx
+++ b/Project_SRS.docx
@@ -95,6 +95,29 @@
                 <w:szCs w:val="18"/>
               </w:rPr>
               <w:t xml:space="preserve">This revision migrates the delivery platform from a JavaFX desktop application to a browser-based web application built with Angular, and migrates the database from MySQL to PostgreSQL. The Spring Boot REST backend, the domain model, and all functional requirements are unchanged. Only the client technology, database engine, and related interface descriptions (Sections 2.2, 5.1–5.4) have been updated.</w:t>
+            </w:r>
+          </w:p>
+          <w:p>
+            <w:pPr>
+              <w:spacing w:after="60"/>
+            </w:pPr>
+            <w:r>
+              <w:rPr>
+                <w:b/>
+                <w:bCs/>
+                <w:sz w:val="20"/>
+                <w:szCs w:val="20"/>
+              </w:rPr>
+              <w:t xml:space="preserve">Phase-3 Revision Note (as-built alignment)</w:t>
+            </w:r>
+          </w:p>
+          <w:p>
+            <w:r>
+              <w:rPr>
+                <w:sz w:val="18"/>
+                <w:szCs w:val="18"/>
+              </w:rPr>
+              <w:t xml:space="preserve">This revision brings the specification into line with the delivered system. Added: Section 2.4 (Order &amp; Table Lifecycle), which was previously stated only in the glossary; FR-25 (table service flag); and Section 3.8, User Management (FR-26 to FR-28), a module the access matrix in Section 2.1 already granted to the Manager but for which no requirement had been written. Clarified: FR-07, FR-08, FR-15, FR-16, FR-23, FR-24, NFR-03, NFR-05, NFR-06, and the platform statements in Sections 2.2 and 5.4. No requirement has been removed, weakened, or renumbered.</w:t>
             </w:r>
           </w:p>
         </w:tc>
@@ -744,6 +767,19 @@
       </w:pPr>
       <w:r>
         <w:t xml:space="preserve">Manual inventory adjustments with audit logging</w:t>
+      </w:r>
+    </w:p>
+    <w:p>
+      <w:pPr>
+        <w:pStyle w:val="ListParagraph"/>
+        <w:numPr>
+          <w:ilvl w:val="0"/>
+          <w:numId w:val="1"/>
+        </w:numPr>
+        <w:spacing w:after="40"/>
+      </w:pPr>
+      <w:r>
+        <w:t xml:space="preserve">Manager-administered staff accounts, with a role assigned at registration</w:t>
       </w:r>
     </w:p>
     <w:p>
@@ -2131,7 +2167,7 @@
         <w:spacing w:after="40"/>
       </w:pPr>
       <w:r>
-        <w:t xml:space="preserve">Backend: Spring Boot REST API</w:t>
+        <w:t xml:space="preserve">Backend: Spring Boot REST API on Java 21</w:t>
       </w:r>
     </w:p>
     <w:p>
@@ -2144,7 +2180,7 @@
         <w:spacing w:after="40"/>
       </w:pPr>
       <w:r>
-        <w:t xml:space="preserve">Database: PostgreSQL</w:t>
+        <w:t xml:space="preserve">Database: PostgreSQL, hosted on a managed serverless provider and reached over a TLS-required connection</w:t>
       </w:r>
     </w:p>
     <w:p>
@@ -2249,6 +2285,434 @@
       </w:pPr>
       <w:r>
         <w:t xml:space="preserve">The system operates on a stable local or networked database connection</w:t>
+      </w:r>
+    </w:p>
+    <w:p>
+      <w:pPr>
+        <w:pStyle w:val="Heading2"/>
+        <w:spacing w:after="80" w:before="180"/>
+      </w:pPr>
+      <w:r>
+        <w:rPr>
+          <w:b/>
+          <w:bCs/>
+        </w:rPr>
+        <w:t xml:space="preserve">2.4 Order &amp; Table Lifecycle</w:t>
+      </w:r>
+    </w:p>
+    <w:p>
+      <w:pPr>
+        <w:spacing w:after="100"/>
+      </w:pPr>
+      <w:r>
+        <w:t xml:space="preserve">The order lifecycle is the backbone of the system: every requirement in Section 3 either advances an order along it or reads a value it produced. An order holds exactly one status at a time and shall move only forward along the transitions below. Any request for a transition that is not listed shall be rejected and shall leave the order unchanged.</w:t>
+      </w:r>
+    </w:p>
+    <w:tbl>
+      <w:tblPr>
+        <w:tblW w:type="dxa" w:w="9360"/>
+        <w:tblBorders>
+          <w:top w:val="single" w:color="auto" w:sz="4"/>
+          <w:left w:val="single" w:color="auto" w:sz="4"/>
+          <w:bottom w:val="single" w:color="auto" w:sz="4"/>
+          <w:right w:val="single" w:color="auto" w:sz="4"/>
+          <w:insideH w:val="single" w:color="auto" w:sz="4"/>
+          <w:insideV w:val="single" w:color="auto" w:sz="4"/>
+        </w:tblBorders>
+      </w:tblPr>
+      <w:tblGrid>
+        <w:gridCol w:w="1800"/>
+        <w:gridCol w:w="7560"/>
+      </w:tblGrid>
+      <w:tr>
+        <w:trPr>
+          <w:tblHeader/>
+        </w:trPr>
+        <w:tc>
+          <w:tcPr>
+            <w:tcW w:type="dxa" w:w="1800"/>
+            <w:shd w:fill="D9D9D9" w:color="auto" w:val="clear"/>
+            <w:tcMar>
+              <w:top w:type="dxa" w:w="40"/>
+              <w:left w:type="dxa" w:w="80"/>
+              <w:bottom w:type="dxa" w:w="40"/>
+              <w:right w:type="dxa" w:w="80"/>
+            </w:tcMar>
+          </w:tcPr>
+          <w:p>
+            <w:pPr>
+              <w:jc w:val="left"/>
+            </w:pPr>
+            <w:r>
+              <w:rPr>
+                <w:b/>
+                <w:bCs/>
+                <w:sz w:val="20"/>
+                <w:szCs w:val="20"/>
+              </w:rPr>
+              <w:t xml:space="preserve">Status</w:t>
+            </w:r>
+          </w:p>
+        </w:tc>
+        <w:tc>
+          <w:tcPr>
+            <w:tcW w:type="dxa" w:w="7560"/>
+            <w:shd w:fill="D9D9D9" w:color="auto" w:val="clear"/>
+            <w:tcMar>
+              <w:top w:type="dxa" w:w="40"/>
+              <w:left w:type="dxa" w:w="80"/>
+              <w:bottom w:type="dxa" w:w="40"/>
+              <w:right w:type="dxa" w:w="80"/>
+            </w:tcMar>
+          </w:tcPr>
+          <w:p>
+            <w:pPr>
+              <w:jc w:val="left"/>
+            </w:pPr>
+            <w:r>
+              <w:rPr>
+                <w:b/>
+                <w:bCs/>
+                <w:sz w:val="20"/>
+                <w:szCs w:val="20"/>
+              </w:rPr>
+              <w:t xml:space="preserve">Meaning and permitted next state</w:t>
+            </w:r>
+          </w:p>
+        </w:tc>
+      </w:tr>
+      <w:tr>
+        <w:tc>
+          <w:tcPr>
+            <w:tcW w:type="dxa" w:w="1800"/>
+            <w:tcMar>
+              <w:top w:type="dxa" w:w="40"/>
+              <w:left w:type="dxa" w:w="80"/>
+              <w:bottom w:type="dxa" w:w="40"/>
+              <w:right w:type="dxa" w:w="80"/>
+            </w:tcMar>
+          </w:tcPr>
+          <w:p>
+            <w:pPr>
+              <w:jc w:val="left"/>
+            </w:pPr>
+            <w:r>
+              <w:rPr>
+                <w:b/>
+                <w:bCs/>
+                <w:sz w:val="20"/>
+                <w:szCs w:val="20"/>
+              </w:rPr>
+              <w:t xml:space="preserve">PENDING</w:t>
+            </w:r>
+          </w:p>
+        </w:tc>
+        <w:tc>
+          <w:tcPr>
+            <w:tcW w:type="dxa" w:w="7560"/>
+            <w:tcMar>
+              <w:top w:type="dxa" w:w="40"/>
+              <w:left w:type="dxa" w:w="80"/>
+              <w:bottom w:type="dxa" w:w="40"/>
+              <w:right w:type="dxa" w:w="80"/>
+            </w:tcMar>
+          </w:tcPr>
+          <w:p>
+            <w:pPr>
+              <w:jc w:val="left"/>
+            </w:pPr>
+            <w:r>
+              <w:rPr>
+                <w:b w:val="false"/>
+                <w:bCs w:val="false"/>
+                <w:sz w:val="20"/>
+                <w:szCs w:val="20"/>
+              </w:rPr>
+              <w:t xml:space="preserve">Open on a table and being built by the waiter. The only state in which lines may be added, changed, or removed (FR-07). Next: CONFIRMED.</w:t>
+            </w:r>
+          </w:p>
+        </w:tc>
+      </w:tr>
+      <w:tr>
+        <w:tc>
+          <w:tcPr>
+            <w:tcW w:type="dxa" w:w="1800"/>
+            <w:tcMar>
+              <w:top w:type="dxa" w:w="40"/>
+              <w:left w:type="dxa" w:w="80"/>
+              <w:bottom w:type="dxa" w:w="40"/>
+              <w:right w:type="dxa" w:w="80"/>
+            </w:tcMar>
+          </w:tcPr>
+          <w:p>
+            <w:pPr>
+              <w:jc w:val="left"/>
+            </w:pPr>
+            <w:r>
+              <w:rPr>
+                <w:b/>
+                <w:bCs/>
+                <w:sz w:val="20"/>
+                <w:szCs w:val="20"/>
+              </w:rPr>
+              <w:t xml:space="preserve">CONFIRMED</w:t>
+            </w:r>
+          </w:p>
+        </w:tc>
+        <w:tc>
+          <w:tcPr>
+            <w:tcW w:type="dxa" w:w="7560"/>
+            <w:tcMar>
+              <w:top w:type="dxa" w:w="40"/>
+              <w:left w:type="dxa" w:w="80"/>
+              <w:bottom w:type="dxa" w:w="40"/>
+              <w:right w:type="dxa" w:w="80"/>
+            </w:tcMar>
+          </w:tcPr>
+          <w:p>
+            <w:pPr>
+              <w:jc w:val="left"/>
+            </w:pPr>
+            <w:r>
+              <w:rPr>
+                <w:b w:val="false"/>
+                <w:bCs w:val="false"/>
+                <w:sz w:val="20"/>
+                <w:szCs w:val="20"/>
+              </w:rPr>
+              <w:t xml:space="preserve">Sent to the kitchen queue and visible on the kitchen display; the contents are locked (FR-09). Next: PREPARING.</w:t>
+            </w:r>
+          </w:p>
+        </w:tc>
+      </w:tr>
+      <w:tr>
+        <w:tc>
+          <w:tcPr>
+            <w:tcW w:type="dxa" w:w="1800"/>
+            <w:tcMar>
+              <w:top w:type="dxa" w:w="40"/>
+              <w:left w:type="dxa" w:w="80"/>
+              <w:bottom w:type="dxa" w:w="40"/>
+              <w:right w:type="dxa" w:w="80"/>
+            </w:tcMar>
+          </w:tcPr>
+          <w:p>
+            <w:pPr>
+              <w:jc w:val="left"/>
+            </w:pPr>
+            <w:r>
+              <w:rPr>
+                <w:b/>
+                <w:bCs/>
+                <w:sz w:val="20"/>
+                <w:szCs w:val="20"/>
+              </w:rPr>
+              <w:t xml:space="preserve">PREPARING</w:t>
+            </w:r>
+          </w:p>
+        </w:tc>
+        <w:tc>
+          <w:tcPr>
+            <w:tcW w:type="dxa" w:w="7560"/>
+            <w:tcMar>
+              <w:top w:type="dxa" w:w="40"/>
+              <w:left w:type="dxa" w:w="80"/>
+              <w:bottom w:type="dxa" w:w="40"/>
+              <w:right w:type="dxa" w:w="80"/>
+            </w:tcMar>
+          </w:tcPr>
+          <w:p>
+            <w:pPr>
+              <w:jc w:val="left"/>
+            </w:pPr>
+            <w:r>
+              <w:rPr>
+                <w:b w:val="false"/>
+                <w:bCs w:val="false"/>
+                <w:sz w:val="20"/>
+                <w:szCs w:val="20"/>
+              </w:rPr>
+              <w:t xml:space="preserve">The kitchen has started cooking (FR-12). Next: READY.</w:t>
+            </w:r>
+          </w:p>
+        </w:tc>
+      </w:tr>
+      <w:tr>
+        <w:tc>
+          <w:tcPr>
+            <w:tcW w:type="dxa" w:w="1800"/>
+            <w:tcMar>
+              <w:top w:type="dxa" w:w="40"/>
+              <w:left w:type="dxa" w:w="80"/>
+              <w:bottom w:type="dxa" w:w="40"/>
+              <w:right w:type="dxa" w:w="80"/>
+            </w:tcMar>
+          </w:tcPr>
+          <w:p>
+            <w:pPr>
+              <w:jc w:val="left"/>
+            </w:pPr>
+            <w:r>
+              <w:rPr>
+                <w:b/>
+                <w:bCs/>
+                <w:sz w:val="20"/>
+                <w:szCs w:val="20"/>
+              </w:rPr>
+              <w:t xml:space="preserve">READY</w:t>
+            </w:r>
+          </w:p>
+        </w:tc>
+        <w:tc>
+          <w:tcPr>
+            <w:tcW w:type="dxa" w:w="7560"/>
+            <w:tcMar>
+              <w:top w:type="dxa" w:w="40"/>
+              <w:left w:type="dxa" w:w="80"/>
+              <w:bottom w:type="dxa" w:w="40"/>
+              <w:right w:type="dxa" w:w="80"/>
+            </w:tcMar>
+          </w:tcPr>
+          <w:p>
+            <w:pPr>
+              <w:jc w:val="left"/>
+            </w:pPr>
+            <w:r>
+              <w:rPr>
+                <w:b w:val="false"/>
+                <w:bCs w:val="false"/>
+                <w:sz w:val="20"/>
+                <w:szCs w:val="20"/>
+              </w:rPr>
+              <w:t xml:space="preserve">The kitchen has finished; the order awaits delivery to the table and leaves the kitchen queue (FR-12). Next: SERVED.</w:t>
+            </w:r>
+          </w:p>
+        </w:tc>
+      </w:tr>
+      <w:tr>
+        <w:tc>
+          <w:tcPr>
+            <w:tcW w:type="dxa" w:w="1800"/>
+            <w:tcMar>
+              <w:top w:type="dxa" w:w="40"/>
+              <w:left w:type="dxa" w:w="80"/>
+              <w:bottom w:type="dxa" w:w="40"/>
+              <w:right w:type="dxa" w:w="80"/>
+            </w:tcMar>
+          </w:tcPr>
+          <w:p>
+            <w:pPr>
+              <w:jc w:val="left"/>
+            </w:pPr>
+            <w:r>
+              <w:rPr>
+                <w:b/>
+                <w:bCs/>
+                <w:sz w:val="20"/>
+                <w:szCs w:val="20"/>
+              </w:rPr>
+              <w:t xml:space="preserve">SERVED</w:t>
+            </w:r>
+          </w:p>
+        </w:tc>
+        <w:tc>
+          <w:tcPr>
+            <w:tcW w:type="dxa" w:w="7560"/>
+            <w:tcMar>
+              <w:top w:type="dxa" w:w="40"/>
+              <w:left w:type="dxa" w:w="80"/>
+              <w:bottom w:type="dxa" w:w="40"/>
+              <w:right w:type="dxa" w:w="80"/>
+            </w:tcMar>
+          </w:tcPr>
+          <w:p>
+            <w:pPr>
+              <w:jc w:val="left"/>
+            </w:pPr>
+            <w:r>
+              <w:rPr>
+                <w:b w:val="false"/>
+                <w:bCs w:val="false"/>
+                <w:sz w:val="20"/>
+                <w:szCs w:val="20"/>
+              </w:rPr>
+              <w:t xml:space="preserve">Delivered to the table (FR-10); the order is now billable (FR-13). Next: PAID.</w:t>
+            </w:r>
+          </w:p>
+        </w:tc>
+      </w:tr>
+      <w:tr>
+        <w:tc>
+          <w:tcPr>
+            <w:tcW w:type="dxa" w:w="1800"/>
+            <w:tcMar>
+              <w:top w:type="dxa" w:w="40"/>
+              <w:left w:type="dxa" w:w="80"/>
+              <w:bottom w:type="dxa" w:w="40"/>
+              <w:right w:type="dxa" w:w="80"/>
+            </w:tcMar>
+          </w:tcPr>
+          <w:p>
+            <w:pPr>
+              <w:jc w:val="left"/>
+            </w:pPr>
+            <w:r>
+              <w:rPr>
+                <w:b/>
+                <w:bCs/>
+                <w:sz w:val="20"/>
+                <w:szCs w:val="20"/>
+              </w:rPr>
+              <w:t xml:space="preserve">PAID</w:t>
+            </w:r>
+          </w:p>
+        </w:tc>
+        <w:tc>
+          <w:tcPr>
+            <w:tcW w:type="dxa" w:w="7560"/>
+            <w:tcMar>
+              <w:top w:type="dxa" w:w="40"/>
+              <w:left w:type="dxa" w:w="80"/>
+              <w:bottom w:type="dxa" w:w="40"/>
+              <w:right w:type="dxa" w:w="80"/>
+            </w:tcMar>
+          </w:tcPr>
+          <w:p>
+            <w:pPr>
+              <w:jc w:val="left"/>
+            </w:pPr>
+            <w:r>
+              <w:rPr>
+                <w:b w:val="false"/>
+                <w:bCs w:val="false"/>
+                <w:sz w:val="20"/>
+                <w:szCs w:val="20"/>
+              </w:rPr>
+              <w:t xml:space="preserve">Settled, the table released and stock deducted (FR-15, FR-19). Terminal: no further transition, edit, cancellation, or refund is permitted.</w:t>
+            </w:r>
+          </w:p>
+        </w:tc>
+      </w:tr>
+    </w:tbl>
+    <w:p>
+      <w:pPr>
+        <w:spacing w:after="100"/>
+      </w:pPr>
+    </w:p>
+    <w:p>
+      <w:pPr>
+        <w:spacing w:after="100"/>
+      </w:pPr>
+      <w:r>
+        <w:t xml:space="preserve">Table occupancy is a consequence of the order lifecycle rather than an independently editable value: creating an order occupies the table (FR-06) and payment releases it (FR-15). A table is AVAILABLE when it carries no open order and OCCUPIED while it does. NEEDS_SERVICE is a flag a waiter raises on an occupied table (FR-25); it does not affect the order status and does not free the table.</w:t>
+      </w:r>
+    </w:p>
+    <w:p>
+      <w:pPr>
+        <w:spacing w:after="100"/>
+      </w:pPr>
+      <w:r>
+        <w:t xml:space="preserve">Ingredient stock is not reserved when an order is taken. The check at item-add time (FR-08) tests stock as it stands at that moment, and the single authoritative deduction occurs at payment (FR-19). Two orders may therefore each pass validation for the last portion of an ingredient; the first payment succeeds and the second is refused under FR-22. This is a deliberate decision: it keeps the deduction at one point in the system rather than splitting it between a reservation and a settlement.</w:t>
       </w:r>
     </w:p>
     <w:p>
@@ -2893,7 +3357,7 @@
                 <w:sz w:val="20"/>
                 <w:szCs w:val="20"/>
               </w:rPr>
-              <w:t xml:space="preserve">Waiter shall add menu items to an order, specifying quantity and optional notes per item. Items may only be added or removed while the order status is PENDING (before confirmation).</w:t>
+              <w:t xml:space="preserve">Waiter shall add menu items to an order, specifying quantity and optional notes per item, and shall change the quantity of, or remove, an existing line. Items may only be added, changed, or removed while the order status is PENDING (before confirmation). Adding a menu item that already appears on the order with identical notes shall increase the quantity of that existing line rather than create a second one. Each line shall record the menu item price in force at the moment the line was added, so that a subsequent change to the menu price does not alter the total of an order already taken.</w:t>
             </w:r>
           </w:p>
         </w:tc>
@@ -2945,7 +3409,7 @@
                 <w:sz w:val="20"/>
                 <w:szCs w:val="20"/>
               </w:rPr>
-              <w:t xml:space="preserve">When a waiter attempts to add an item, the system shall validate: (a) the menu item is marked available, and (b) sufficient ingredient stock exists to fulfill the requested quantity. If validation fails, the system shall reject the item, display a descriptive error message, and leave the order unchanged.</w:t>
+              <w:t xml:space="preserve">When a waiter attempts to add an item, the system shall validate: (a) the menu item is marked available, and (b) sufficient ingredient stock exists to fulfill the requested quantity. If validation fails, the system shall reject the item, display a descriptive error message, and leave the order unchanged. The stock check shall account for the quantity of each ingredient already committed by the other lines of the same order, not for the requested line in isolation. This check does not reserve stock (see Section 2.4).</w:t>
             </w:r>
           </w:p>
         </w:tc>
@@ -3050,6 +3514,58 @@
                 <w:szCs w:val="20"/>
               </w:rPr>
               <w:t xml:space="preserve">Waiter shall mark an order as SERVED after food has been delivered to the table.</w:t>
+            </w:r>
+          </w:p>
+        </w:tc>
+      </w:tr>
+      <w:tr>
+        <w:tc>
+          <w:tcPr>
+            <w:tcW w:type="dxa" w:w="1200"/>
+            <w:tcMar>
+              <w:top w:type="dxa" w:w="40"/>
+              <w:left w:type="dxa" w:w="80"/>
+              <w:bottom w:type="dxa" w:w="40"/>
+              <w:right w:type="dxa" w:w="80"/>
+            </w:tcMar>
+          </w:tcPr>
+          <w:p>
+            <w:pPr>
+              <w:jc w:val="left"/>
+            </w:pPr>
+            <w:r>
+              <w:rPr>
+                <w:b/>
+                <w:bCs/>
+                <w:sz w:val="20"/>
+                <w:szCs w:val="20"/>
+              </w:rPr>
+              <w:t xml:space="preserve">FR-25</w:t>
+            </w:r>
+          </w:p>
+        </w:tc>
+        <w:tc>
+          <w:tcPr>
+            <w:tcW w:type="dxa" w:w="8160"/>
+            <w:tcMar>
+              <w:top w:type="dxa" w:w="40"/>
+              <w:left w:type="dxa" w:w="80"/>
+              <w:bottom w:type="dxa" w:w="40"/>
+              <w:right w:type="dxa" w:w="80"/>
+            </w:tcMar>
+          </w:tcPr>
+          <w:p>
+            <w:pPr>
+              <w:jc w:val="left"/>
+            </w:pPr>
+            <w:r>
+              <w:rPr>
+                <w:b w:val="false"/>
+                <w:bCs w:val="false"/>
+                <w:sz w:val="20"/>
+                <w:szCs w:val="20"/>
+              </w:rPr>
+              <w:t xml:space="preserve">Waiter shall raise and clear a needs-service flag on an occupied table. The flag shall be visible to every role permitted to view the floor, and shall not affect the order status or the table occupancy (see Section 2.4).</w:t>
             </w:r>
           </w:p>
         </w:tc>
@@ -3493,7 +4009,7 @@
                 <w:sz w:val="20"/>
                 <w:szCs w:val="20"/>
               </w:rPr>
-              <w:t xml:space="preserve">Cashier shall record the payment method and confirm payment. Upon successful payment: (a) the order status shall be updated to PAID, (b) the table status shall be reset to AVAILABLE, and (c) the system shall automatically trigger ingredient deduction as defined in FR-19.</w:t>
+              <w:t xml:space="preserve">Cashier shall record the payment method and confirm payment. Upon successful payment: (a) the order status shall be updated to PAID, (b) the table status shall be reset to AVAILABLE, and (c) the system shall automatically trigger ingredient deduction as defined in FR-19. If that deduction cannot be completed because stock is insufficient (FR-22), the payment shall be refused in its entirety: no payment is recorded, the order remains SERVED, the table remains OCCUPIED, and no stock is deducted.</w:t>
             </w:r>
           </w:p>
         </w:tc>
@@ -3545,7 +4061,7 @@
                 <w:sz w:val="20"/>
                 <w:szCs w:val="20"/>
               </w:rPr>
-              <w:t xml:space="preserve">The system shall generate a receipt upon payment containing: order ID, table number, date and time, list of items with quantity and unit price, subtotal, tax amount, service charge, and grand total.</w:t>
+              <w:t xml:space="preserve">The system shall generate a receipt upon payment containing: order ID, table number, date and time, list of items with quantity and unit price, subtotal, tax amount, service charge, and grand total. The receipt shall additionally record the payment method and the cashier who settled it, shall remain retrievable after payment so that it can be reprinted, and shall present the amounts and the rates that produced them as frozen at the moment of payment.</w:t>
             </w:r>
           </w:p>
         </w:tc>
@@ -4093,7 +4609,7 @@
                 <w:sz w:val="20"/>
                 <w:szCs w:val="20"/>
               </w:rPr>
-              <w:t xml:space="preserve">The manager shall view a sales summary for a specified date range, including total revenue, number of orders completed, and breakdown by menu category.</w:t>
+              <w:t xml:space="preserve">The manager shall view a sales summary for a specified date range, including total revenue, number of orders completed, and breakdown by menu category. The date range shall be interpreted as inclusive calendar days in the restaurant's configured timezone. All figures shall be derived from recorded payments rather than recomputed from current menu prices, so that a later price or rate change cannot alter a past report.</w:t>
             </w:r>
           </w:p>
         </w:tc>
@@ -4145,7 +4661,7 @@
                 <w:sz w:val="20"/>
                 <w:szCs w:val="20"/>
               </w:rPr>
-              <w:t xml:space="preserve">The manager shall view the top-selling menu items ranked by quantity sold within a specified date range.</w:t>
+              <w:t xml:space="preserve">The manager shall view the top-selling menu items ranked by quantity sold within a specified date range. The date range is interpreted as in FR-23.</w:t>
             </w:r>
           </w:p>
         </w:tc>
@@ -4154,6 +4670,254 @@
     <w:p>
       <w:pPr>
         <w:spacing w:after="120"/>
+      </w:pPr>
+    </w:p>
+    <w:p>
+      <w:pPr>
+        <w:pStyle w:val="Heading2"/>
+        <w:spacing w:after="80" w:before="180"/>
+      </w:pPr>
+      <w:r>
+        <w:rPr>
+          <w:b/>
+          <w:bCs/>
+        </w:rPr>
+        <w:t xml:space="preserve">3.8 User Management (Manager)</w:t>
+      </w:r>
+    </w:p>
+    <w:tbl>
+      <w:tblPr>
+        <w:tblW w:type="dxa" w:w="9360"/>
+        <w:tblBorders>
+          <w:top w:val="single" w:color="auto" w:sz="4"/>
+          <w:left w:val="single" w:color="auto" w:sz="4"/>
+          <w:bottom w:val="single" w:color="auto" w:sz="4"/>
+          <w:right w:val="single" w:color="auto" w:sz="4"/>
+          <w:insideH w:val="single" w:color="auto" w:sz="4"/>
+          <w:insideV w:val="single" w:color="auto" w:sz="4"/>
+        </w:tblBorders>
+      </w:tblPr>
+      <w:tblGrid>
+        <w:gridCol w:w="1200"/>
+        <w:gridCol w:w="8160"/>
+      </w:tblGrid>
+      <w:tr>
+        <w:trPr>
+          <w:tblHeader/>
+        </w:trPr>
+        <w:tc>
+          <w:tcPr>
+            <w:tcW w:type="dxa" w:w="1200"/>
+            <w:shd w:fill="D9D9D9" w:color="auto" w:val="clear"/>
+            <w:tcMar>
+              <w:top w:type="dxa" w:w="40"/>
+              <w:left w:type="dxa" w:w="80"/>
+              <w:bottom w:type="dxa" w:w="40"/>
+              <w:right w:type="dxa" w:w="80"/>
+            </w:tcMar>
+          </w:tcPr>
+          <w:p>
+            <w:pPr>
+              <w:jc w:val="left"/>
+            </w:pPr>
+            <w:r>
+              <w:rPr>
+                <w:b/>
+                <w:bCs/>
+                <w:sz w:val="20"/>
+                <w:szCs w:val="20"/>
+              </w:rPr>
+              <w:t xml:space="preserve">ID</w:t>
+            </w:r>
+          </w:p>
+        </w:tc>
+        <w:tc>
+          <w:tcPr>
+            <w:tcW w:type="dxa" w:w="8160"/>
+            <w:shd w:fill="D9D9D9" w:color="auto" w:val="clear"/>
+            <w:tcMar>
+              <w:top w:type="dxa" w:w="40"/>
+              <w:left w:type="dxa" w:w="80"/>
+              <w:bottom w:type="dxa" w:w="40"/>
+              <w:right w:type="dxa" w:w="80"/>
+            </w:tcMar>
+          </w:tcPr>
+          <w:p>
+            <w:pPr>
+              <w:jc w:val="left"/>
+            </w:pPr>
+            <w:r>
+              <w:rPr>
+                <w:b/>
+                <w:bCs/>
+                <w:sz w:val="20"/>
+                <w:szCs w:val="20"/>
+              </w:rPr>
+              <w:t xml:space="preserve">Requirement</w:t>
+            </w:r>
+          </w:p>
+        </w:tc>
+      </w:tr>
+      <w:tr>
+        <w:tc>
+          <w:tcPr>
+            <w:tcW w:type="dxa" w:w="1200"/>
+            <w:tcMar>
+              <w:top w:type="dxa" w:w="40"/>
+              <w:left w:type="dxa" w:w="80"/>
+              <w:bottom w:type="dxa" w:w="40"/>
+              <w:right w:type="dxa" w:w="80"/>
+            </w:tcMar>
+          </w:tcPr>
+          <w:p>
+            <w:pPr>
+              <w:jc w:val="left"/>
+            </w:pPr>
+            <w:r>
+              <w:rPr>
+                <w:b/>
+                <w:bCs/>
+                <w:sz w:val="20"/>
+                <w:szCs w:val="20"/>
+              </w:rPr>
+              <w:t xml:space="preserve">FR-26</w:t>
+            </w:r>
+          </w:p>
+        </w:tc>
+        <w:tc>
+          <w:tcPr>
+            <w:tcW w:type="dxa" w:w="8160"/>
+            <w:tcMar>
+              <w:top w:type="dxa" w:w="40"/>
+              <w:left w:type="dxa" w:w="80"/>
+              <w:bottom w:type="dxa" w:w="40"/>
+              <w:right w:type="dxa" w:w="80"/>
+            </w:tcMar>
+          </w:tcPr>
+          <w:p>
+            <w:pPr>
+              <w:jc w:val="left"/>
+            </w:pPr>
+            <w:r>
+              <w:rPr>
+                <w:b w:val="false"/>
+                <w:bCs w:val="false"/>
+                <w:sz w:val="20"/>
+                <w:szCs w:val="20"/>
+              </w:rPr>
+              <w:t xml:space="preserve">Manager shall register a staff account with a username, a display name, and a role, and shall update the display name and role of an existing account. There is no self-registration; an account can be created only by a Manager.</w:t>
+            </w:r>
+          </w:p>
+        </w:tc>
+      </w:tr>
+      <w:tr>
+        <w:tc>
+          <w:tcPr>
+            <w:tcW w:type="dxa" w:w="1200"/>
+            <w:tcMar>
+              <w:top w:type="dxa" w:w="40"/>
+              <w:left w:type="dxa" w:w="80"/>
+              <w:bottom w:type="dxa" w:w="40"/>
+              <w:right w:type="dxa" w:w="80"/>
+            </w:tcMar>
+          </w:tcPr>
+          <w:p>
+            <w:pPr>
+              <w:jc w:val="left"/>
+            </w:pPr>
+            <w:r>
+              <w:rPr>
+                <w:b/>
+                <w:bCs/>
+                <w:sz w:val="20"/>
+                <w:szCs w:val="20"/>
+              </w:rPr>
+              <w:t xml:space="preserve">FR-27</w:t>
+            </w:r>
+          </w:p>
+        </w:tc>
+        <w:tc>
+          <w:tcPr>
+            <w:tcW w:type="dxa" w:w="8160"/>
+            <w:tcMar>
+              <w:top w:type="dxa" w:w="40"/>
+              <w:left w:type="dxa" w:w="80"/>
+              <w:bottom w:type="dxa" w:w="40"/>
+              <w:right w:type="dxa" w:w="80"/>
+            </w:tcMar>
+          </w:tcPr>
+          <w:p>
+            <w:pPr>
+              <w:jc w:val="left"/>
+            </w:pPr>
+            <w:r>
+              <w:rPr>
+                <w:b w:val="false"/>
+                <w:bCs w:val="false"/>
+                <w:sz w:val="20"/>
+                <w:szCs w:val="20"/>
+              </w:rPr>
+              <w:t xml:space="preserve">Manager shall reset the password of any staff account. Stored passwords shall never be displayed or recoverable; replacement is the only supported operation.</w:t>
+            </w:r>
+          </w:p>
+        </w:tc>
+      </w:tr>
+      <w:tr>
+        <w:tc>
+          <w:tcPr>
+            <w:tcW w:type="dxa" w:w="1200"/>
+            <w:tcMar>
+              <w:top w:type="dxa" w:w="40"/>
+              <w:left w:type="dxa" w:w="80"/>
+              <w:bottom w:type="dxa" w:w="40"/>
+              <w:right w:type="dxa" w:w="80"/>
+            </w:tcMar>
+          </w:tcPr>
+          <w:p>
+            <w:pPr>
+              <w:jc w:val="left"/>
+            </w:pPr>
+            <w:r>
+              <w:rPr>
+                <w:b/>
+                <w:bCs/>
+                <w:sz w:val="20"/>
+                <w:szCs w:val="20"/>
+              </w:rPr>
+              <w:t xml:space="preserve">FR-28</w:t>
+            </w:r>
+          </w:p>
+        </w:tc>
+        <w:tc>
+          <w:tcPr>
+            <w:tcW w:type="dxa" w:w="8160"/>
+            <w:tcMar>
+              <w:top w:type="dxa" w:w="40"/>
+              <w:left w:type="dxa" w:w="80"/>
+              <w:bottom w:type="dxa" w:w="40"/>
+              <w:right w:type="dxa" w:w="80"/>
+            </w:tcMar>
+          </w:tcPr>
+          <w:p>
+            <w:pPr>
+              <w:jc w:val="left"/>
+            </w:pPr>
+            <w:r>
+              <w:rPr>
+                <w:b w:val="false"/>
+                <w:bCs w:val="false"/>
+                <w:sz w:val="20"/>
+                <w:szCs w:val="20"/>
+              </w:rPr>
+              <w:t xml:space="preserve">Manager shall disable and re-enable a staff account. Accounts shall not be deleted, so that the orders, payments, and audit records attributed to them remain intact. Disabling an account, or changing its role, shall take effect on that account's next request rather than when its existing session expires.</w:t>
+            </w:r>
+          </w:p>
+        </w:tc>
+      </w:tr>
+    </w:tbl>
+    <w:p>
+      <w:pPr>
+        <w:spacing w:after="100"/>
       </w:pPr>
     </w:p>
     <w:p>
@@ -4495,7 +5259,7 @@
                 <w:sz w:val="20"/>
                 <w:szCs w:val="20"/>
               </w:rPr>
-              <w:t xml:space="preserve">User passwords shall be stored as salted hashes. Authentication shall use JWT bearer tokens. The backend REST API shall enforce RBAC on every endpoint, rejecting unauthorized requests with an appropriate HTTP error response regardless of client-side controls.</w:t>
+              <w:t xml:space="preserve">User passwords shall be stored as salted hashes. Authentication shall use JWT bearer tokens. The backend REST API shall enforce RBAC on every endpoint, rejecting unauthorized requests with an appropriate HTTP error response regardless of client-side controls. Authorization shall be re-evaluated from the stored user record on every request, so that disabling an account or changing its role takes effect on the next request rather than when the existing token expires.</w:t>
             </w:r>
           </w:p>
         </w:tc>
@@ -4649,7 +5413,7 @@
                 <w:sz w:val="20"/>
                 <w:szCs w:val="20"/>
               </w:rPr>
-              <w:t xml:space="preserve">The system shall follow a layered architecture (presentation, service, repository) with clearly separated concerns. Software design patterns shall be applied where appropriate to support modularity and extensibility.</w:t>
+              <w:t xml:space="preserve">The system shall follow a layered architecture (presentation, service, repository) with clearly separated concerns. Software design patterns shall be applied where appropriate to support modularity and extensibility. Conformance to the layering shall be verified automatically by the build rather than by review alone.</w:t>
             </w:r>
           </w:p>
         </w:tc>
@@ -4726,7 +5490,7 @@
                 <w:sz w:val="20"/>
                 <w:szCs w:val="20"/>
               </w:rPr>
-              <w:t xml:space="preserve">All manual inventory adjustments shall be persisted in an immutable audit log (see FR-21). Audit records shall not be editable or deletable through any user interface.</w:t>
+              <w:t xml:space="preserve">All manual inventory adjustments shall be persisted in an immutable audit log (see FR-21). Audit records shall not be editable or deletable through any user interface or API route, and immutability shall additionally be enforced by the database itself, so that no direct SQL statement can amend or remove a recorded adjustment.</w:t>
             </w:r>
           </w:p>
         </w:tc>
@@ -5009,7 +5773,7 @@
         <w:spacing w:after="40"/>
       </w:pPr>
       <w:r>
-        <w:t xml:space="preserve">Database migrations managed with version control (e.g., Flyway or Liquibase)</w:t>
+        <w:t xml:space="preserve">Database migrations managed with Flyway, versioned in the repository and applied automatically at startup; the ORM validates the schema against the migrations and never modifies it</w:t>
       </w:r>
     </w:p>
     <w:p>
@@ -5126,7 +5890,7 @@
         <w:spacing w:after="40"/>
       </w:pPr>
       <w:r>
-        <w:t xml:space="preserve">All users must be pre-registered by a system administrator; self-registration is not supported</w:t>
+        <w:t xml:space="preserve">All users must be pre-registered by a Manager (FR-26); self-registration is not supported</w:t>
       </w:r>
     </w:p>
     <w:p>

</xml_diff>